<commit_message>
ACP 0900193-90: v2 das peças após verificação adversarial e laudos de caminho e citações
- Peça principal: desistência da gratuidade com identificação precisa (Ev. 280 dos autos de origem), leitura correta do art. 99 §7º, pedido b simplificado, sede conforme JUCESC, valor ancorado na guia do Ev. 31, declaração de autenticidade
- Procuração: aceite do outorgado, poderes de recolher custas e intimação exclusiva, ratificação nominativa ampliada
- Peça 03: retirado o pedido de certidão das comunicações às renunciantes
- Relatório: correção sobre a Circular CGJ 643/2025 e apêndices com o caminho processual detalhado
- Geradores: blocos centralizados mantidos juntos na quebra de página

Co-Authored-By: Claude Fable 5.1 <noreply@anthropic.com>
Claude-Session: https://claude.ai/code/session_01CCVbA1mc4UdnaFNsukuTYT
</commit_message>
<xml_diff>
--- a/juridico/ACP-0900193-90.2016.8.24.0064/2026-09-02-cumprimento-ev25/pecas/01-peticao-cumprimento-ev25.docx
+++ b/juridico/ACP-0900193-90.2016.8.24.0064/2026-09-02-cumprimento-ev25/pecas/01-peticao-cumprimento-ev25.docx
@@ -4,6 +4,8 @@
   <w:body>
     <w:p>
       <w:pPr>
+        <w:keepNext/>
+        <w:keepLines/>
         <w:spacing w:after="120" w:line="360"/>
         <w:jc w:val="center"/>
       </w:pPr>
@@ -18,6 +20,8 @@
     </w:p>
     <w:p>
       <w:pPr>
+        <w:keepNext/>
+        <w:keepLines/>
         <w:spacing w:after="120" w:line="360"/>
         <w:jc w:val="center"/>
       </w:pPr>
@@ -34,6 +38,8 @@
     </w:p>
     <w:p>
       <w:pPr>
+        <w:keepNext/>
+        <w:keepLines/>
         <w:spacing w:after="120" w:line="360"/>
         <w:jc w:val="center"/>
       </w:pPr>
@@ -48,6 +54,8 @@
     </w:p>
     <w:p>
       <w:pPr>
+        <w:keepNext/>
+        <w:keepLines/>
         <w:spacing w:after="120" w:line="360"/>
         <w:jc w:val="center"/>
       </w:pPr>
@@ -62,6 +70,8 @@
     </w:p>
     <w:p>
       <w:pPr>
+        <w:keepNext/>
+        <w:keepLines/>
         <w:spacing w:after="120" w:line="360"/>
         <w:jc w:val="center"/>
       </w:pPr>
@@ -76,6 +86,8 @@
     </w:p>
     <w:p>
       <w:pPr>
+        <w:keepNext w:val="false"/>
+        <w:keepLines/>
         <w:spacing w:after="120" w:line="360"/>
         <w:jc w:val="center"/>
       </w:pPr>
@@ -100,7 +112,7 @@
           <w:sz w:val="24"/>
           <w:szCs w:val="24"/>
         </w:rPr>
-        <w:t xml:space="preserve">ANTUNELLI E ANTUNELLI INSTITUIÇÃO DE IDOSOS LTDA., pessoa jurídica de direito privado, inscrita no CNPJ sob o n. 02.145.891/0001-08, com sede na Rua Vergilino Domingos da Silva, n. 1.003, Bairro Serraria, São José/SC, CEP 88.115-170, apelante nos autos em epígrafe, vem, por seu advogado infra-assinado, inscrito na OAB/SC sob o n. 53.040, com escritório na Rua Angelita Figueiredo, n. 1.596, Sala 1004, Torre B, Bairro Areias, São José/SC, CEP 88.113-710, endereço eletrônico gfdoes@gmail.com, em cumprimento ao despacho do Evento 25, expor e requerer o que segue.</w:t>
+        <w:t xml:space="preserve">ANTUNELLI E ANTUNELLI INSTITUIÇÃO DE IDOSOS LTDA., pessoa jurídica de direito privado, inscrita no CNPJ sob o n. 02.145.891/0001-08, com sede registrada na Rua Vergilino Domingos da Silva, n. 1.100, e estabelecimento na mesma via, n. 1.003, Loteamento Canaã, Bairro Serraria, São José/SC, CEP 88.115-170, apelante nos autos em epígrafe, vem, por seu advogado infra-assinado, inscrito na OAB/SC sob o n. 53.040, com escritório na Rua Angelita Figueiredo, n. 1.596, Sala 1004, Torre B, Bairro Areias, São José/SC, CEP 88.113-710, endereço eletrônico gfdoes@gmail.com, em cumprimento ao despacho do Evento 25, expor e requerer o que segue.</w:t>
       </w:r>
     </w:p>
     <w:p>
@@ -132,7 +144,7 @@
           <w:sz w:val="24"/>
           <w:szCs w:val="24"/>
         </w:rPr>
-        <w:t xml:space="preserve">1. No Evento 25 (26/08/2026), Vossa Excelência assentou que não há nos autos decisão concedendo a gratuidade da justiça à apelante — a anotação constante da capa decorreu de erro de cadastro do cartório de origem, já retificado (Eventos 22 e 23) — e, com fundamento no art. 99, § 2º, do Código de Processo Civil e na Súmula 481 do Superior Tribunal de Justiça, determinou a prévia intimação da apelante para, no prazo de cinco dias, comprovar os pressupostos da gratuidade ou recolher o preparo recursal, sob pena de deserção. [CONFERIR NO EPROC: cotejar com a transcrição literal do dispositivo do Evento 25]</w:t>
+        <w:t xml:space="preserve">1. No Evento 25 (26/08/2026), Vossa Excelência assentou que não há nos autos decisão concedendo a gratuidade da justiça à apelante — a anotação de gratuidade constante da autuação decorreu de erro de cadastro, já retificado (Eventos 22 e 23) — e, com fundamento no art. 99, § 2º, do Código de Processo Civil e na Súmula 481 do Superior Tribunal de Justiça, determinou a prévia intimação da apelante para, no prazo de cinco dias, comprovar os pressupostos da gratuidade ou recolher o preparo recursal, sob pena de deserção. [CONFERIR NO EPROC: cotejar com a transcrição literal do dispositivo do Evento 25]</w:t>
       </w:r>
     </w:p>
     <w:p>
@@ -179,52 +191,52 @@
           <w:sz w:val="24"/>
           <w:szCs w:val="24"/>
         </w:rPr>
-        <w:t xml:space="preserve">3. Entre as duas alternativas abertas pelo despacho, a apelante optou por recolher o preparo, em vez de produzir a demonstração exigida pela Súmula 481 do STJ.</w:t>
-      </w:r>
-    </w:p>
-    <w:p>
-      <w:pPr>
-        <w:spacing w:after="120" w:line="360"/>
-        <w:ind w:firstLine="709"/>
-        <w:jc w:val="both"/>
-      </w:pPr>
-      <w:r>
-        <w:rPr>
-          <w:rFonts w:ascii="Times New Roman" w:cs="Times New Roman" w:eastAsia="Times New Roman" w:hAnsi="Times New Roman"/>
-          <w:sz w:val="24"/>
-          <w:szCs w:val="24"/>
-        </w:rPr>
-        <w:t xml:space="preserve">4. A guia de preparo recursal de apelação foi emitida pela Seção de Custas Judiciais da Diretoria de Cadastro e Distribuição Processual deste Tribunal em 02/09/2026 (Evento 31), no valor de R$ 720,00 (setecentos e vinte reais), correspondente ao item de recolhimento n. 51010131, calculado pelo sistema com base no Anexo Único da Lei estadual n. 17.654/2018, na tabela vigente para 2026 (Circular CGJ n. 643/2025). Tratando-se de autos eletrônicos, não há porte de remessa e retorno.</w:t>
-      </w:r>
-    </w:p>
-    <w:p>
-      <w:pPr>
-        <w:spacing w:after="120" w:line="360"/>
-        <w:ind w:firstLine="709"/>
-        <w:jc w:val="both"/>
-      </w:pPr>
-      <w:r>
-        <w:rPr>
-          <w:rFonts w:ascii="Times New Roman" w:cs="Times New Roman" w:eastAsia="Times New Roman" w:hAnsi="Times New Roman"/>
-          <w:sz w:val="24"/>
-          <w:szCs w:val="24"/>
-        </w:rPr>
-        <w:t xml:space="preserve">5. O pagamento foi efetuado em 02/09/2026, pelo meio disponibilizado no Evento 32, e está comprovado no Doc. 1, que reúne a guia, o comprovante de pagamento e o extrato da guia. [CONFERIR: meio de pagamento — cartão ou boleto — e situação da guia na aba "Custas" antes de protocolar]</w:t>
-      </w:r>
-    </w:p>
-    <w:p>
-      <w:pPr>
-        <w:spacing w:after="120" w:line="360"/>
-        <w:ind w:firstLine="709"/>
-        <w:jc w:val="both"/>
-      </w:pPr>
-      <w:r>
-        <w:rPr>
-          <w:rFonts w:ascii="Times New Roman" w:cs="Times New Roman" w:eastAsia="Times New Roman" w:hAnsi="Times New Roman"/>
-          <w:sz w:val="24"/>
-          <w:szCs w:val="24"/>
-        </w:rPr>
-        <w:t xml:space="preserve">6. O recolhimento é tempestivo e singelo. Formulado o requerimento de gratuidade nas razões recursais (Evento 280; certidão do Evento 23), a apelante estava dispensada de comprovar o preparo no ato da interposição, cabendo ao relator, se o caso, fixar prazo para o recolhimento — que é exatamente o que fez o despacho do Evento 25 (CPC, art. 99, § 7º). Não incide, portanto, o § 4º do art. 1.007 do CPC, que pressupõe recorrente que nada recolheu nem requereu no ato da interposição. Recolhido o preparo no prazo assinado por Vossa Excelência, está afastada a deserção (CPC, art. 1.007, caput).</w:t>
+        <w:t xml:space="preserve">3. Entre as duas alternativas abertas pelo despacho, a apelante optou pela segunda — o recolhimento do preparo —, o que torna desnecessária a demonstração a que se refere a Súmula 481 do STJ.</w:t>
+      </w:r>
+    </w:p>
+    <w:p>
+      <w:pPr>
+        <w:spacing w:after="120" w:line="360"/>
+        <w:ind w:firstLine="709"/>
+        <w:jc w:val="both"/>
+      </w:pPr>
+      <w:r>
+        <w:rPr>
+          <w:rFonts w:ascii="Times New Roman" w:cs="Times New Roman" w:eastAsia="Times New Roman" w:hAnsi="Times New Roman"/>
+          <w:sz w:val="24"/>
+          <w:szCs w:val="24"/>
+        </w:rPr>
+        <w:t xml:space="preserve">4. A guia de preparo recursal de apelação foi emitida pela Seção de Custas Judiciais da Diretoria de Cadastro e Distribuição Processual deste Tribunal em 02/09/2026 (Evento 31), no valor de R$ 720,00 (setecentos e vinte reais), identificada no sistema sob o n. 51010131 [CONFERIR NO EPROC: número da guia constante do Evento 31 e coincidência com o Doc. 1], calculada pelo próprio sistema do Tribunal com base no Anexo Único da Lei estadual n. 17.654/2018, com os valores atualizados para o exercício de 2026. Tratando-se de autos eletrônicos, não há porte de remessa e retorno (CPC, art. 1.007, § 3º).</w:t>
+      </w:r>
+    </w:p>
+    <w:p>
+      <w:pPr>
+        <w:spacing w:after="120" w:line="360"/>
+        <w:ind w:firstLine="709"/>
+        <w:jc w:val="both"/>
+      </w:pPr>
+      <w:r>
+        <w:rPr>
+          <w:rFonts w:ascii="Times New Roman" w:cs="Times New Roman" w:eastAsia="Times New Roman" w:hAnsi="Times New Roman"/>
+          <w:sz w:val="24"/>
+          <w:szCs w:val="24"/>
+        </w:rPr>
+        <w:t xml:space="preserve">5. O pagamento foi efetuado em 02/09/2026, pelo meio disponibilizado no Evento 32, e está comprovado no Doc. 1, que reúne a guia, o comprovante de pagamento e o extrato da guia. [CONFERIR NO EPROC ANTES DE PROTOCOLAR: meio de pagamento (cartão ou boleto), pagamento integral e à vista, data efetiva do pagamento e situação "paga/baixada" da guia na aba "Custas" do 2º grau; se a guia ainda constar "aguardando compensação", suprimir a expressão "e o extrato da guia" e manter guia e comprovante]</w:t>
+      </w:r>
+    </w:p>
+    <w:p>
+      <w:pPr>
+        <w:spacing w:after="120" w:line="360"/>
+        <w:ind w:firstLine="709"/>
+        <w:jc w:val="both"/>
+      </w:pPr>
+      <w:r>
+        <w:rPr>
+          <w:rFonts w:ascii="Times New Roman" w:cs="Times New Roman" w:eastAsia="Times New Roman" w:hAnsi="Times New Roman"/>
+          <w:sz w:val="24"/>
+          <w:szCs w:val="24"/>
+        </w:rPr>
+        <w:t xml:space="preserve">6. O recolhimento é tempestivo e singelo. Formulado o requerimento de gratuidade nas razões recursais (Evento 280 dos autos de origem; certidão do Evento 23 deste recurso), a apelante estava dispensada de comprovar o preparo no ato da interposição (CPC, art. 99, § 7º), e o despacho do Evento 25, na forma do § 2º do mesmo artigo, facultou-lhe, em alternativa à demonstração dos pressupostos do benefício, o recolhimento em prazo certo — alternativa que a apelante exerceu. Não incide, portanto, o § 4º do art. 1.007 do CPC: a hipótese de quem requereu a gratuidade no ato da interposição é regida pela norma especial do art. 99, § 7º, que prevê recolhimento singelo no prazo fixado pelo relator, e não pela regra geral do recolhimento em dobro, reservada a quem simplesmente deixou de comprovar o preparo. Recolhido o preparo no prazo assinado por Vossa Excelência, está afastada a deserção (CPC, art. 1.007, caput).</w:t>
       </w:r>
     </w:p>
     <w:p>
@@ -271,37 +283,37 @@
           <w:sz w:val="24"/>
           <w:szCs w:val="24"/>
         </w:rPr>
-        <w:t xml:space="preserve">8. O recolhimento do preparo substituiu, por opção exercida no prazo aberto pelo relator, o requerimento de gratuidade formulado nas razões recursais. Por isso, a apelante desiste expressamente do requerimento incidental de gratuidade da justiça formulado no Evento 280 e requer que seja declarado prejudicado, sem qualquer reflexo sobre o conhecimento da apelação, cujo preparo está integralmente recolhido.</w:t>
-      </w:r>
-    </w:p>
-    <w:p>
-      <w:pPr>
-        <w:spacing w:after="120" w:line="360"/>
-        <w:ind w:firstLine="709"/>
-        <w:jc w:val="both"/>
-      </w:pPr>
-      <w:r>
-        <w:rPr>
-          <w:rFonts w:ascii="Times New Roman" w:cs="Times New Roman" w:eastAsia="Times New Roman" w:hAnsi="Times New Roman"/>
-          <w:sz w:val="24"/>
-          <w:szCs w:val="24"/>
-        </w:rPr>
-        <w:t xml:space="preserve">9. Pela mesma razão, fica sem objeto o item "b" dos memoriais do Evento 17, que partia da anotação cadastral de gratuidade "deferida", posteriormente retificada (Eventos 22 e 23).</w:t>
-      </w:r>
-    </w:p>
-    <w:p>
-      <w:pPr>
-        <w:spacing w:after="120" w:line="360"/>
-        <w:ind w:firstLine="709"/>
-        <w:jc w:val="both"/>
-      </w:pPr>
-      <w:r>
-        <w:rPr>
-          <w:rFonts w:ascii="Times New Roman" w:cs="Times New Roman" w:eastAsia="Times New Roman" w:hAnsi="Times New Roman"/>
-          <w:sz w:val="24"/>
-          <w:szCs w:val="24"/>
-        </w:rPr>
-        <w:t xml:space="preserve">10. Não há, aqui, ato incompatível com o interesse de recorrer (Súmula 51 deste Tribunal): o recolhimento não acompanhou o pedido de gratuidade; veio em seu lugar, como cumprimento da alternativa fixada no Evento 25. De todo modo, a consequência prevista naquele enunciado limita-se ao ponto — o pedido de gratuidade —, que a apelante desde já abandona.</w:t>
+        <w:t xml:space="preserve">8. O recolhimento do preparo substituiu, por opção exercida no prazo aberto pelo relator, o requerimento de gratuidade formulado nas razões recursais. Por isso, a apelante desiste expressamente do requerimento incidental de gratuidade da justiça formulado nas razões recursais (Evento 280 dos autos de origem, conforme certidão do Evento 23 deste recurso) e requer que seja declarado prejudicado, sem qualquer reflexo sobre o conhecimento da apelação, cujo preparo está integralmente recolhido.</w:t>
+      </w:r>
+    </w:p>
+    <w:p>
+      <w:pPr>
+        <w:spacing w:after="120" w:line="360"/>
+        <w:ind w:firstLine="709"/>
+        <w:jc w:val="both"/>
+      </w:pPr>
+      <w:r>
+        <w:rPr>
+          <w:rFonts w:ascii="Times New Roman" w:cs="Times New Roman" w:eastAsia="Times New Roman" w:hAnsi="Times New Roman"/>
+          <w:sz w:val="24"/>
+          <w:szCs w:val="24"/>
+        </w:rPr>
+        <w:t xml:space="preserve">9. Pela mesma razão, fica sem objeto apenas o item "b" dos memoriais do Evento 17, que partia da anotação cadastral de gratuidade "deferida", posteriormente retificada (Eventos 22 e 23). Ficam mantidos, no mais, o recurso de apelação e os demais requerimentos dos memoriais.</w:t>
+      </w:r>
+    </w:p>
+    <w:p>
+      <w:pPr>
+        <w:spacing w:after="120" w:line="360"/>
+        <w:ind w:firstLine="709"/>
+        <w:jc w:val="both"/>
+      </w:pPr>
+      <w:r>
+        <w:rPr>
+          <w:rFonts w:ascii="Times New Roman" w:cs="Times New Roman" w:eastAsia="Times New Roman" w:hAnsi="Times New Roman"/>
+          <w:sz w:val="24"/>
+          <w:szCs w:val="24"/>
+        </w:rPr>
+        <w:t xml:space="preserve">10. Não há, aqui, ato incompatível com o interesse de recorrer (Súmula 51 deste Tribunal): o recolhimento não acompanhou o pedido de gratuidade; veio em seu lugar, como cumprimento da alternativa fixada no Evento 25. De todo modo, a consequência prevista naquele enunciado limita-se ao ponto — o requerimento de gratuidade —, do qual a apelante desiste expressamente, mantido integralmente o recurso.</w:t>
       </w:r>
     </w:p>
     <w:p>
@@ -380,7 +392,7 @@
           <w:sz w:val="24"/>
           <w:szCs w:val="24"/>
         </w:rPr>
-        <w:t xml:space="preserve">13. A apelante é sociedade limitada unipessoal. Seu sócio único e administrador é o advogado que subscreve esta petição, conforme a Sétima Alteração do Contrato Social arquivada na JUCESC em 08/06/2021, já constante dos autos de origem (Evento 257, CONTRSOCIAL9). A vontade da apelante de recorrer e de defender-se nestes autos nunca foi duvidosa.</w:t>
+        <w:t xml:space="preserve">13. A apelante é sociedade limitada unipessoal. Seu sócio único e administrador, com poderes de representação judicial ativa e passiva (Cláusula Quinta), é o advogado que subscreve esta petição, conforme a Sétima Alteração do Contrato Social arquivada na JUCESC em 08/06/2021, já constante dos autos de origem (Evento 257, CONTRSOCIAL9). A vontade da apelante de recorrer e de defender-se nestes autos nunca foi duvidosa.</w:t>
       </w:r>
     </w:p>
     <w:p>
@@ -457,7 +469,7 @@
           <w:sz w:val="24"/>
           <w:szCs w:val="24"/>
         </w:rPr>
-        <w:t xml:space="preserve">b) a homologação da desistência do requerimento de gratuidade da justiça formulado nas razões recursais (Evento 280), declarando-o prejudicado, com a anotação correspondente no cadastro deste grau e comunicação ao juízo de origem para o mesmo fim;</w:t>
+        <w:t xml:space="preserve">b) que se declare prejudicado, ante a desistência expressa manifestada no capítulo III, o requerimento de gratuidade da justiça formulado nas razões recursais (Evento 280 dos autos de origem);</w:t>
       </w:r>
     </w:p>
     <w:p>
@@ -608,11 +620,13 @@
           <w:sz w:val="24"/>
           <w:szCs w:val="24"/>
         </w:rPr>
-        <w:t xml:space="preserve">17. O subscritor declara autênticas as cópias digitalizadas que acompanham esta petição (Lei n. 11.419/2006, art. 11, § 1º; CPC, art. 425, IV).</w:t>
-      </w:r>
-    </w:p>
-    <w:p>
-      <w:pPr>
+        <w:t xml:space="preserve">17. O subscritor declara autênticas as reproduções digitalizadas que acompanham esta petição (Lei n. 11.419/2006, art. 11, § 1º; CPC, art. 425, VI).</w:t>
+      </w:r>
+    </w:p>
+    <w:p>
+      <w:pPr>
+        <w:keepNext/>
+        <w:keepLines/>
         <w:spacing w:after="120" w:line="360"/>
         <w:jc w:val="center"/>
       </w:pPr>
@@ -627,6 +641,8 @@
     </w:p>
     <w:p>
       <w:pPr>
+        <w:keepNext/>
+        <w:keepLines/>
         <w:spacing w:after="120" w:line="360"/>
         <w:jc w:val="center"/>
       </w:pPr>
@@ -641,6 +657,8 @@
     </w:p>
     <w:p>
       <w:pPr>
+        <w:keepNext/>
+        <w:keepLines/>
         <w:spacing w:after="120" w:line="360"/>
         <w:jc w:val="center"/>
       </w:pPr>
@@ -657,6 +675,8 @@
     </w:p>
     <w:p>
       <w:pPr>
+        <w:keepNext w:val="false"/>
+        <w:keepLines/>
         <w:spacing w:after="120" w:line="360"/>
         <w:jc w:val="center"/>
       </w:pPr>

</xml_diff>

<commit_message>
ACP 0900193-90: v4 — peça principal ajustada pela lente de forma (cabeçalho completo, títulos uniformes, siglas, pedido d sem duplicidade, art. 425 VI)
Co-Authored-By: Claude Fable 5.1 <noreply@anthropic.com>
Claude-Session: https://claude.ai/code/session_01CCVbA1mc4UdnaFNsukuTYT
</commit_message>
<xml_diff>
--- a/juridico/ACP-0900193-90.2016.8.24.0064/2026-09-02-cumprimento-ev25/pecas/01-peticao-cumprimento-ev25.docx
+++ b/juridico/ACP-0900193-90.2016.8.24.0064/2026-09-02-cumprimento-ev25/pecas/01-peticao-cumprimento-ev25.docx
@@ -65,7 +65,39 @@
           <w:sz w:val="24"/>
           <w:szCs w:val="24"/>
         </w:rPr>
+        <w:t xml:space="preserve">Apelante (litisconsorte passivo): Município de São José</w:t>
+      </w:r>
+    </w:p>
+    <w:p>
+      <w:pPr>
+        <w:keepNext/>
+        <w:keepLines/>
+        <w:spacing w:after="120" w:line="360"/>
+        <w:jc w:val="center"/>
+      </w:pPr>
+      <w:r>
+        <w:rPr>
+          <w:rFonts w:ascii="Times New Roman" w:cs="Times New Roman" w:eastAsia="Times New Roman" w:hAnsi="Times New Roman"/>
+          <w:sz w:val="24"/>
+          <w:szCs w:val="24"/>
+        </w:rPr>
         <w:t xml:space="preserve">Apelado: Ministério Público do Estado de Santa Catarina</w:t>
+      </w:r>
+    </w:p>
+    <w:p>
+      <w:pPr>
+        <w:keepNext/>
+        <w:keepLines/>
+        <w:spacing w:after="120" w:line="360"/>
+        <w:jc w:val="center"/>
+      </w:pPr>
+      <w:r>
+        <w:rPr>
+          <w:rFonts w:ascii="Times New Roman" w:cs="Times New Roman" w:eastAsia="Times New Roman" w:hAnsi="Times New Roman"/>
+          <w:sz w:val="24"/>
+          <w:szCs w:val="24"/>
+        </w:rPr>
+        <w:t xml:space="preserve">Relator: Des. Carlos Adilson Silva — Gabinete 03</w:t>
       </w:r>
     </w:p>
     <w:p>
@@ -129,22 +161,22 @@
           <w:sz w:val="24"/>
           <w:szCs w:val="24"/>
         </w:rPr>
-        <w:t xml:space="preserve">I — O despacho do Evento 25 e a tempestividade desta manifestação</w:t>
-      </w:r>
-    </w:p>
-    <w:p>
-      <w:pPr>
-        <w:spacing w:after="120" w:line="360"/>
-        <w:ind w:firstLine="709"/>
-        <w:jc w:val="both"/>
-      </w:pPr>
-      <w:r>
-        <w:rPr>
-          <w:rFonts w:ascii="Times New Roman" w:cs="Times New Roman" w:eastAsia="Times New Roman" w:hAnsi="Times New Roman"/>
-          <w:sz w:val="24"/>
-          <w:szCs w:val="24"/>
-        </w:rPr>
-        <w:t xml:space="preserve">1. No Evento 25 (26/08/2026), Vossa Excelência assentou que não há nos autos decisão concedendo a gratuidade da justiça à apelante — a anotação de gratuidade constante da autuação decorreu de erro de cadastro, já retificado (Eventos 22 e 23) — e, com fundamento no art. 99, § 2º, do Código de Processo Civil e na Súmula 481 do Superior Tribunal de Justiça, determinou a prévia intimação da apelante para, no prazo de cinco dias, comprovar os pressupostos da gratuidade ou recolher o preparo recursal, sob pena de deserção. [CONFERIR NO EPROC: cotejar com a transcrição literal do dispositivo do Evento 25]</w:t>
+        <w:t xml:space="preserve">I — Do despacho do Evento 25 e da tempestividade desta manifestação</w:t>
+      </w:r>
+    </w:p>
+    <w:p>
+      <w:pPr>
+        <w:spacing w:after="120" w:line="360"/>
+        <w:ind w:firstLine="709"/>
+        <w:jc w:val="both"/>
+      </w:pPr>
+      <w:r>
+        <w:rPr>
+          <w:rFonts w:ascii="Times New Roman" w:cs="Times New Roman" w:eastAsia="Times New Roman" w:hAnsi="Times New Roman"/>
+          <w:sz w:val="24"/>
+          <w:szCs w:val="24"/>
+        </w:rPr>
+        <w:t xml:space="preserve">1. No Evento 25 (26/08/2026), Vossa Excelência assentou que não há nos autos decisão concedendo a gratuidade da justiça à apelante — a anotação de gratuidade constante da autuação decorreu de erro de cadastro, já retificado (Eventos 22 e 23) — e, com fundamento no art. 99, § 2º, do Código de Processo Civil (CPC) e na Súmula 481 do Superior Tribunal de Justiça (STJ), determinou a prévia intimação da apelante para, no prazo de cinco dias, comprovar os pressupostos da gratuidade ou recolher o preparo recursal, sob pena de deserção. [CONFERIR NO EPROC: cotejar com a transcrição literal do dispositivo do Evento 25]</w:t>
       </w:r>
     </w:p>
     <w:p>
@@ -251,7 +283,7 @@
           <w:sz w:val="24"/>
           <w:szCs w:val="24"/>
         </w:rPr>
-        <w:t xml:space="preserve">7. Se, por qualquer razão, se entender haver dúvida quanto ao valor, à vinculação da guia ao recurso ou à compensação do pagamento, a apelante requer, desde logo, a intimação para complementação ou saneamento no prazo de cinco dias, na forma do art. 1.007, §§ 2º e 7º, do CPC, antes de qualquer consequência processual.</w:t>
+        <w:t xml:space="preserve">7. Caso, por qualquer razão, se entenda haver dúvida quanto ao valor, à vinculação da guia ao recurso ou à compensação do pagamento, a apelante requer, desde logo, a intimação para complementação ou saneamento no prazo de cinco dias, na forma do art. 1.007, §§ 2º e 7º, do CPC, antes de qualquer consequência processual.</w:t>
       </w:r>
     </w:p>
     <w:p>
@@ -283,7 +315,7 @@
           <w:sz w:val="24"/>
           <w:szCs w:val="24"/>
         </w:rPr>
-        <w:t xml:space="preserve">8. O recolhimento do preparo substituiu, por opção exercida no prazo aberto pelo relator, o requerimento de gratuidade formulado nas razões recursais. Por isso, a apelante desiste expressamente do requerimento incidental de gratuidade da justiça formulado nas razões recursais (Evento 280 dos autos de origem, conforme certidão do Evento 23 deste recurso) e requer que seja declarado prejudicado (CPC, art. 200), sem qualquer reflexo sobre o conhecimento da apelação, cujo preparo está integralmente recolhido.</w:t>
+        <w:t xml:space="preserve">8. O recolhimento do preparo substituiu, por opção exercida no prazo assinado por Vossa Excelência, o requerimento de gratuidade formulado nas razões recursais. Por isso, a apelante desiste expressamente do requerimento incidental de gratuidade da justiça formulado nas razões recursais (Evento 280 dos autos de origem, conforme certidão do Evento 23 deste recurso) e requer que seja declarado prejudicado (CPC, art. 200), sem qualquer reflexo sobre o conhecimento da apelação, cujo preparo está integralmente recolhido.</w:t>
       </w:r>
     </w:p>
     <w:p>
@@ -313,7 +345,7 @@
           <w:sz w:val="24"/>
           <w:szCs w:val="24"/>
         </w:rPr>
-        <w:t xml:space="preserve">10. Não há, aqui, ato incompatível com o interesse de recorrer (Súmula 51 deste Tribunal): o recolhimento não acompanhou o pedido de gratuidade; veio em seu lugar, como cumprimento da alternativa fixada no Evento 25. De todo modo, a consequência prevista naquele enunciado limita-se ao ponto — o requerimento de gratuidade —, do qual a apelante desiste expressamente, mantido integralmente o recurso.</w:t>
+        <w:t xml:space="preserve">10. Não há, aqui, ato incompatível com o interesse de recorrer (Súmula 51 deste Tribunal): o recolhimento não acompanhou o pedido de gratuidade; veio em seu lugar, como cumprimento da alternativa fixada no Evento 25. De todo modo, a consequência prevista naquele enunciado limita-se ao ponto — o requerimento de gratuidade —, de que a apelante já desistiu expressamente (item 8), mantido integralmente o recurso.</w:t>
       </w:r>
     </w:p>
     <w:p>
@@ -330,22 +362,22 @@
           <w:sz w:val="24"/>
           <w:szCs w:val="24"/>
         </w:rPr>
-        <w:t xml:space="preserve">IV — Registro da cronologia</w:t>
-      </w:r>
-    </w:p>
-    <w:p>
-      <w:pPr>
-        <w:spacing w:after="120" w:line="360"/>
-        <w:ind w:firstLine="709"/>
-        <w:jc w:val="both"/>
-      </w:pPr>
-      <w:r>
-        <w:rPr>
-          <w:rFonts w:ascii="Times New Roman" w:cs="Times New Roman" w:eastAsia="Times New Roman" w:hAnsi="Times New Roman"/>
-          <w:sz w:val="24"/>
-          <w:szCs w:val="24"/>
-        </w:rPr>
-        <w:t xml:space="preserve">11. Apenas para documentar a cronologia, registra-se que a anotação cadastral de gratuidade "deferida" (Evento 293 dos autos de origem; Eventos 3 e 4 deste recurso) foi retificada em 21/08/2026 (Eventos 22 e 23) e que, em 02/09/2026, o sistema ainda tarjava os itens de preparo da apelante, impedindo a emissão da guia, que só foi gerada pela Seção de Custas Judiciais no mesmo dia, após solicitação do subscritor (Eventos 31 e 32; Doc. 4). O recolhimento seguiu-se imediatamente, dentro do prazo do Evento 27.</w:t>
+        <w:t xml:space="preserve">IV — Do registro da cronologia</w:t>
+      </w:r>
+    </w:p>
+    <w:p>
+      <w:pPr>
+        <w:spacing w:after="120" w:line="360"/>
+        <w:ind w:firstLine="709"/>
+        <w:jc w:val="both"/>
+      </w:pPr>
+      <w:r>
+        <w:rPr>
+          <w:rFonts w:ascii="Times New Roman" w:cs="Times New Roman" w:eastAsia="Times New Roman" w:hAnsi="Times New Roman"/>
+          <w:sz w:val="24"/>
+          <w:szCs w:val="24"/>
+        </w:rPr>
+        <w:t xml:space="preserve">11. Apenas para documentar a cronologia, registra-se que a anotação cadastral de gratuidade "deferida" (Evento 293 dos autos de origem; Eventos 3 e 4 deste recurso) foi retificada em 21/08/2026 (Eventos 22 e 23) e que, em 02/09/2026, o sistema ainda exibia tarjados — isto é, indisponíveis para emissão — os itens de preparo da apelante, e a guia somente foi gerada pela Seção de Custas Judiciais no mesmo dia, após solicitação do subscritor (Eventos 31 e 32; Doc. 4). O recolhimento seguiu-se imediatamente, dentro do prazo do Evento 27.</w:t>
       </w:r>
     </w:p>
     <w:p>
@@ -392,22 +424,22 @@
           <w:sz w:val="24"/>
           <w:szCs w:val="24"/>
         </w:rPr>
-        <w:t xml:space="preserve">13. A apelante é sociedade limitada unipessoal. Seu sócio único e administrador, com poderes de representação judicial ativa e passiva (Cláusula Quinta), é o advogado que subscreve esta petição, conforme a Sétima Alteração do Contrato Social arquivada na JUCESC em 08/06/2021, já constante dos autos de origem (Evento 257, CONTRSOCIAL9). A vontade da apelante de recorrer e de defender-se nestes autos nunca foi duvidosa.</w:t>
-      </w:r>
-    </w:p>
-    <w:p>
-      <w:pPr>
-        <w:spacing w:after="120" w:line="360"/>
-        <w:ind w:firstLine="709"/>
-        <w:jc w:val="both"/>
-      </w:pPr>
-      <w:r>
-        <w:rPr>
-          <w:rFonts w:ascii="Times New Roman" w:cs="Times New Roman" w:eastAsia="Times New Roman" w:hAnsi="Times New Roman"/>
-          <w:sz w:val="24"/>
-          <w:szCs w:val="24"/>
-        </w:rPr>
-        <w:t xml:space="preserve">14. Em reforço, e para que não paire dúvida quanto à representação da apelante, junta-se procuração atualizada (Doc. 2), outorgada pela sociedade por seu administrador, na forma do art. 75, VIII, do CPC, com poderes gerais e especiais para o foro (CPC, art. 105) e com cláusula pela qual a apelante ratifica expressamente todos os atos praticados em seu nome pelo subscritor nestes autos, nos autos de origem e no incidente n. 5049926-11.2026.8.24.0000 (pedido de efeito suspensivo) — Código Civil, art. 662, parágrafo único —, acompanhada do ato constitutivo vigente (Doc. 3).</w:t>
+        <w:t xml:space="preserve">13. A apelante é sociedade limitada unipessoal. Seu sócio único e administrador, com poderes de representação judicial ativa e passiva (Cláusula Quinta), é o advogado que subscreve esta petição, conforme a Sétima Alteração do Contrato Social arquivada na JUCESC em 08/06/2021, já constante dos autos de origem (Evento 257, CONTRSOCIAL9). O subscritor atua, portanto, na dupla condição de administrador e de advogado da apelante.</w:t>
+      </w:r>
+    </w:p>
+    <w:p>
+      <w:pPr>
+        <w:spacing w:after="120" w:line="360"/>
+        <w:ind w:firstLine="709"/>
+        <w:jc w:val="both"/>
+      </w:pPr>
+      <w:r>
+        <w:rPr>
+          <w:rFonts w:ascii="Times New Roman" w:cs="Times New Roman" w:eastAsia="Times New Roman" w:hAnsi="Times New Roman"/>
+          <w:sz w:val="24"/>
+          <w:szCs w:val="24"/>
+        </w:rPr>
+        <w:t xml:space="preserve">14. Em reforço, e para que não paire dúvida quanto à representação da apelante, junta-se procuração atualizada (Doc. 2), outorgada pela sociedade, por seu administrador, na forma do art. 75, VIII, do CPC, com poderes gerais e especiais para o foro (CPC, art. 105) e com cláusula pela qual a apelante ratifica expressamente todos os atos praticados em seu nome pelo subscritor nestes autos, nos autos de origem e no incidente n. 5049926-11.2026.8.24.0000 (pedido de efeito suspensivo) — Código Civil, art. 662, parágrafo único —, acompanhada do ato constitutivo vigente (Doc. 3).</w:t>
       </w:r>
     </w:p>
     <w:p>
@@ -454,7 +486,7 @@
           <w:sz w:val="24"/>
           <w:szCs w:val="24"/>
         </w:rPr>
-        <w:t xml:space="preserve">a) o recebimento da guia e do comprovante de pagamento (Doc. 1), reconhecendo-se cumprido o despacho do Evento 25 pelo recolhimento tempestivo e integral do preparo, afastada a deserção;</w:t>
+        <w:t xml:space="preserve">a) o recebimento da guia de preparo, do comprovante de pagamento e do extrato da guia (Doc. 1), reconhecendo-se cumprido o despacho do Evento 25 pelo recolhimento tempestivo e integral do preparo, afastada a deserção;</w:t>
       </w:r>
     </w:p>
     <w:p>
@@ -499,7 +531,7 @@
           <w:sz w:val="24"/>
           <w:szCs w:val="24"/>
         </w:rPr>
-        <w:t xml:space="preserve">d) a juntada da procuração (Doc. 2) e do ato constitutivo (Doc. 3), com a anotação do mandato e a atualização do cadastro da apelante quanto à denominação (Antunelli e Antunelli Instituição de Idosos Ltda.), bem como a juntada dos documentos do Doc. 4;</w:t>
+        <w:t xml:space="preserve">d) a juntada da procuração (Doc. 2) e do ato constitutivo da apelante (Doc. 3), com a anotação do mandato no cadastro de procuradores, e a juntada dos documentos que compõem o Doc. 4;</w:t>
       </w:r>
     </w:p>
     <w:p>
@@ -567,7 +599,25 @@
           <w:sz w:val="24"/>
           <w:szCs w:val="24"/>
         </w:rPr>
-        <w:t xml:space="preserve">Doc. 2 — Procuração ad judicia et extra, com cláusula de ratificação;</w:t>
+        <w:t xml:space="preserve">Doc. 2 — Procuração </w:t>
+      </w:r>
+      <w:r>
+        <w:rPr>
+          <w:rFonts w:ascii="Times New Roman" w:cs="Times New Roman" w:eastAsia="Times New Roman" w:hAnsi="Times New Roman"/>
+          <w:i/>
+          <w:iCs/>
+          <w:sz w:val="24"/>
+          <w:szCs w:val="24"/>
+        </w:rPr>
+        <w:t xml:space="preserve">ad judicia et extra</w:t>
+      </w:r>
+      <w:r>
+        <w:rPr>
+          <w:rFonts w:ascii="Times New Roman" w:cs="Times New Roman" w:eastAsia="Times New Roman" w:hAnsi="Times New Roman"/>
+          <w:sz w:val="24"/>
+          <w:szCs w:val="24"/>
+        </w:rPr>
+        <w:t xml:space="preserve">, com cláusula de ratificação;</w:t>
       </w:r>
     </w:p>
     <w:p>
@@ -620,7 +670,7 @@
           <w:sz w:val="24"/>
           <w:szCs w:val="24"/>
         </w:rPr>
-        <w:t xml:space="preserve">17. O subscritor declara autênticas as reproduções digitalizadas que acompanham esta petição (Lei n. 11.419/2006, art. 11, § 1º; CPC, art. 425, VI).</w:t>
+        <w:t xml:space="preserve">17. O subscritor declara autênticas as reproduções digitalizadas que acompanham esta petição, cujos originais permanecem sob sua guarda (Lei n. 11.419/2006, art. 11, § 1º; CPC, art. 425, VI e § 1º).</w:t>
       </w:r>
     </w:p>
     <w:p>

</xml_diff>

<commit_message>
ACP 0900193-90: v8 — petição de cadastro com datas da renúncia distinguidas, sem detalhes de publicações erradas; assinaturas com endereço; CC 1.053 na procuração
Co-Authored-By: Claude Fable 5.1 <noreply@anthropic.com>
Claude-Session: https://claude.ai/code/session_01CCVbA1mc4UdnaFNsukuTYT
</commit_message>
<xml_diff>
--- a/juridico/ACP-0900193-90.2016.8.24.0064/2026-09-02-cumprimento-ev25/pecas/01-peticao-cumprimento-ev25.docx
+++ b/juridico/ACP-0900193-90.2016.8.24.0064/2026-09-02-cumprimento-ev25/pecas/01-peticao-cumprimento-ev25.docx
@@ -725,6 +725,22 @@
     </w:p>
     <w:p>
       <w:pPr>
+        <w:keepNext/>
+        <w:keepLines/>
+        <w:spacing w:after="120" w:line="360"/>
+        <w:jc w:val="center"/>
+      </w:pPr>
+      <w:r>
+        <w:rPr>
+          <w:rFonts w:ascii="Times New Roman" w:cs="Times New Roman" w:eastAsia="Times New Roman" w:hAnsi="Times New Roman"/>
+          <w:sz w:val="24"/>
+          <w:szCs w:val="24"/>
+        </w:rPr>
+        <w:t xml:space="preserve">OAB/SC 53.040</w:t>
+      </w:r>
+    </w:p>
+    <w:p>
+      <w:pPr>
         <w:keepNext w:val="false"/>
         <w:keepLines/>
         <w:spacing w:after="120" w:line="360"/>
@@ -736,7 +752,7 @@
           <w:sz w:val="24"/>
           <w:szCs w:val="24"/>
         </w:rPr>
-        <w:t xml:space="preserve">OAB/SC 53.040</w:t>
+        <w:t xml:space="preserve">Rua Angelita Figueiredo, n. 1.596, Sala 1004, Torre B, Bairro Areias, São José/SC, CEP 88.113-710 — gfdoes@gmail.com — (48) 98421-6664</w:t>
       </w:r>
     </w:p>
     <w:sectPr>

</xml_diff>

<commit_message>
ACP 0900193-90: v10 — títulos uniformes, denominação social, grafia do advogado sem número de parágrafo, CNPJ no cabeçalho, ressalva sobre boleto
Co-Authored-By: Claude Fable 5.1 <noreply@anthropic.com>
Claude-Session: https://claude.ai/code/session_01CCVbA1mc4UdnaFNsukuTYT
</commit_message>
<xml_diff>
--- a/juridico/ACP-0900193-90.2016.8.24.0064/2026-09-02-cumprimento-ev25/pecas/01-peticao-cumprimento-ev25.docx
+++ b/juridico/ACP-0900193-90.2016.8.24.0064/2026-09-02-cumprimento-ev25/pecas/01-peticao-cumprimento-ev25.docx
@@ -49,7 +49,7 @@
           <w:sz w:val="24"/>
           <w:szCs w:val="24"/>
         </w:rPr>
-        <w:t xml:space="preserve">Apelante: Antunelli e Antunelli Instituição de Idosos Ltda.</w:t>
+        <w:t xml:space="preserve">Apelante: Antunelli e Antunelli Instituição de Idosos Ltda. (CNPJ 02.145.891/0001-08)</w:t>
       </w:r>
     </w:p>
     <w:p>
@@ -223,37 +223,37 @@
           <w:sz w:val="24"/>
           <w:szCs w:val="24"/>
         </w:rPr>
-        <w:t xml:space="preserve">3. Entre as duas alternativas abertas pelo despacho, a apelante optou pela segunda — o recolhimento do preparo —, o que torna desnecessária a demonstração a que se refere a Súmula 481 do STJ.</w:t>
-      </w:r>
-    </w:p>
-    <w:p>
-      <w:pPr>
-        <w:spacing w:after="120" w:line="360"/>
-        <w:ind w:firstLine="709"/>
-        <w:jc w:val="both"/>
-      </w:pPr>
-      <w:r>
-        <w:rPr>
-          <w:rFonts w:ascii="Times New Roman" w:cs="Times New Roman" w:eastAsia="Times New Roman" w:hAnsi="Times New Roman"/>
-          <w:sz w:val="24"/>
-          <w:szCs w:val="24"/>
-        </w:rPr>
-        <w:t xml:space="preserve">4. A guia de preparo recursal de apelação foi emitida pela Seção de Custas Judiciais da Diretoria de Cadastro e Distribuição Processual deste Tribunal em 02/09/2026 (Evento 31), no valor de R$ 720,00 (setecentos e vinte reais), identificada no sistema sob o n. 51010131 [CONFERIR NO EPROC: número da guia constante do Evento 31 e coincidência com o Doc. 1], calculada pelo próprio sistema do Tribunal com base no Anexo Único da Lei estadual n. 17.654/2018, com os valores atualizados para o exercício de 2026. Tratando-se de autos eletrônicos, não há porte de remessa e retorno (CPC, art. 1.007, § 3º).</w:t>
-      </w:r>
-    </w:p>
-    <w:p>
-      <w:pPr>
-        <w:spacing w:after="120" w:line="360"/>
-        <w:ind w:firstLine="709"/>
-        <w:jc w:val="both"/>
-      </w:pPr>
-      <w:r>
-        <w:rPr>
-          <w:rFonts w:ascii="Times New Roman" w:cs="Times New Roman" w:eastAsia="Times New Roman" w:hAnsi="Times New Roman"/>
-          <w:sz w:val="24"/>
-          <w:szCs w:val="24"/>
-        </w:rPr>
-        <w:t xml:space="preserve">5. O pagamento foi efetuado em 02/09/2026, pelo meio disponibilizado no Evento 32, e está comprovado no Doc. 1, que reúne a guia, o comprovante de pagamento e o extrato da guia. [CONFERIR NO EPROC ANTES DE PROTOCOLAR: meio de pagamento (cartão ou boleto), pagamento integral e à vista, data efetiva do pagamento e situação "paga/baixada" da guia na aba "Custas" do 2º grau; se a guia ainda constar "aguardando compensação", suprimir a expressão "e o extrato da guia" e manter guia e comprovante]</w:t>
+        <w:t xml:space="preserve">3. Nada impugnando no despacho, a apelante optou, entre as duas alternativas nele abertas, pela segunda — o recolhimento do preparo —, o que torna desnecessária a demonstração a que se refere a Súmula 481 do STJ.</w:t>
+      </w:r>
+    </w:p>
+    <w:p>
+      <w:pPr>
+        <w:spacing w:after="120" w:line="360"/>
+        <w:ind w:firstLine="709"/>
+        <w:jc w:val="both"/>
+      </w:pPr>
+      <w:r>
+        <w:rPr>
+          <w:rFonts w:ascii="Times New Roman" w:cs="Times New Roman" w:eastAsia="Times New Roman" w:hAnsi="Times New Roman"/>
+          <w:sz w:val="24"/>
+          <w:szCs w:val="24"/>
+        </w:rPr>
+        <w:t xml:space="preserve">4. A guia de preparo recursal de apelação foi emitida pela Seção de Custas Judiciais da Diretoria de Cadastro e Distribuição Processual deste Tribunal em 02/09/2026 (Evento 31), no valor de R$ 720,00 (setecentos e vinte reais), identificada no sistema sob o n. 51010131 [CONFERIR NO EPROC: número/ID e valor constantes da guia do Evento 31 e da aba "Custas" do 2º grau, e coincidência com o Doc. 1; se divergirem do ID lido na tela do 1º grau, substituir pelo número da guia], calculada pelo próprio sistema do Tribunal com base no Anexo Único da Lei estadual n. 17.654/2018, com os valores atualizados para o exercício de 2026. Tratando-se de autos eletrônicos, não há porte de remessa e de retorno a recolher (CPC, art. 1.007, § 3º).</w:t>
+      </w:r>
+    </w:p>
+    <w:p>
+      <w:pPr>
+        <w:spacing w:after="120" w:line="360"/>
+        <w:ind w:firstLine="709"/>
+        <w:jc w:val="both"/>
+      </w:pPr>
+      <w:r>
+        <w:rPr>
+          <w:rFonts w:ascii="Times New Roman" w:cs="Times New Roman" w:eastAsia="Times New Roman" w:hAnsi="Times New Roman"/>
+          <w:sz w:val="24"/>
+          <w:szCs w:val="24"/>
+        </w:rPr>
+        <w:t xml:space="preserve">5. O pagamento foi efetuado em 02/09/2026, pelo meio disponibilizado no Evento 32, e está comprovado no Doc. 1, que reúne a guia, o comprovante de pagamento e o extrato da guia. [MANTER SÓ SE O PAGAMENTO FOI POR BOLETO: O vencimento do boleto não interfere na contagem do prazo processual (Resolução CM n. 3/2019 do TJSC, art. 1º, § 4º); o pagamento efetivou-se em 02/09/2026, dentro do prazo do Evento 27.] [CONFERIR NO EPROC ANTES DE PROTOCOLAR: meio de pagamento (cartão ou boleto), pagamento integral e à vista, data efetiva do pagamento e situação "paga/baixada" da guia na aba "Custas" do 2º grau; se a guia ainda constar "aguardando compensação", suprimir a expressão "e o extrato da guia" e manter guia e comprovante, ajustando no mesmo sentido a alínea "a" dos pedidos e a descrição do Doc. 1]</w:t>
       </w:r>
     </w:p>
     <w:p>
@@ -315,7 +315,7 @@
           <w:sz w:val="24"/>
           <w:szCs w:val="24"/>
         </w:rPr>
-        <w:t xml:space="preserve">8. O recolhimento do preparo substituiu, por opção exercida no prazo assinado por Vossa Excelência, o requerimento de gratuidade formulado nas razões recursais. Por isso, a apelante desiste expressamente do requerimento incidental de gratuidade da justiça formulado nas razões recursais (Evento 280 dos autos de origem, conforme certidão do Evento 23 deste recurso) e requer que seja declarado prejudicado (CPC, art. 200), sem qualquer reflexo sobre o conhecimento da apelação, cujo preparo está integralmente recolhido.</w:t>
+        <w:t xml:space="preserve">8. O recolhimento do preparo substituiu, por opção exercida no prazo assinado por Vossa Excelência, o requerimento de gratuidade formulado nas razões recursais. Por isso, a apelante desiste expressamente do requerimento incidental de gratuidade da justiça formulado nas razões recursais (Evento 280 dos autos de origem, conforme certidão do Evento 23 deste recurso) e requer que seja declarado prejudicado (CPC, art. 200). Não o renova, não o mantém nem o reitera. A desistência não tem qualquer reflexo sobre o conhecimento da apelação, cujo preparo está integralmente recolhido.</w:t>
       </w:r>
     </w:p>
     <w:p>
@@ -702,7 +702,7 @@
           <w:sz w:val="24"/>
           <w:szCs w:val="24"/>
         </w:rPr>
-        <w:t xml:space="preserve">São José/SC, 2 de setembro de 2026.</w:t>
+        <w:t xml:space="preserve">São José/SC, 2 de setembro de 2026. [CONFERIR: data do protocolo efetivo — se for 03/09/2026, ajustar também a data da procuração (Doc. 2) e a da petição de cadastro, que se reporta a "nesta data"]</w:t>
       </w:r>
     </w:p>
     <w:p>

</xml_diff>